<commit_message>
Remove the Contributors list from the draft handbook
Co-Authored-By: Claude Opus 5.5 <noreply@anthropic.com>
Claude-Session: https://claude.ai/code/session_01VkNWz9zCVkDAANuF8jpQYy
</commit_message>
<xml_diff>
--- a/Handbook-Final-Report.docx
+++ b/Handbook-Final-Report.docx
@@ -652,21 +652,7 @@
         <w:rPr>
           <w:rFonts w:ascii="Arial" w:cs="Arial" w:eastAsia="Arial" w:hAnsi="Arial"/>
         </w:rPr>
-        <w:t xml:space="preserve">The abbreviations moved to the back of the book; a </w:t>
-      </w:r>
-      <w:r>
-        <w:rPr>
-          <w:rFonts w:ascii="Arial" w:cs="Arial" w:eastAsia="Arial" w:hAnsi="Arial"/>
-          <w:b/>
-          <w:bCs/>
-        </w:rPr>
-        <w:t xml:space="preserve">Contributors</w:t>
-      </w:r>
-      <w:r>
-        <w:rPr>
-          <w:rFonts w:ascii="Arial" w:cs="Arial" w:eastAsia="Arial" w:hAnsi="Arial"/>
-        </w:rPr>
-        <w:t xml:space="preserve"> list now closes the preface; the acknowledgements were removed.</w:t>
+        <w:t xml:space="preserve">The abbreviations moved to the back of the book; the acknowledgements and the Contributors list were removed from this draft; contributors will be credited in the final version.</w:t>
       </w:r>
     </w:p>
     <w:p>

</xml_diff>

<commit_message>
Start here: open with a real translation decision from a news report
Co-Authored-By: Claude Opus 5.5 <noreply@anthropic.com>
Claude-Session: https://claude.ai/code/session_01VkNWz9zCVkDAANuF8jpQYy
</commit_message>
<xml_diff>
--- a/Handbook-Final-Report.docx
+++ b/Handbook-Final-Report.docx
@@ -1310,6 +1310,58 @@
           <w:rFonts w:ascii="Arial" w:cs="Arial" w:eastAsia="Arial" w:hAnsi="Arial"/>
         </w:rPr>
         <w:t xml:space="preserve">: free translation in Chapter 11 is now taught as too literal → natural → too free, using the team’s example; the three types of equivalence (Chapter 10) are presented as this handbook’s framework, not a fixed order; the Chapter 9 proverb list was trimmed; Chapters 15–17, 20, 22, 25 and 27 were reworded where a statement was too absolute (for example “regime”, machine translation, and the choice of Arabic variety in subtitles); subtitle conventions are marked as conventions, not rules; answers are headed “Check your answers”; the AI statement on the copyright page now says that content selection, translation decisions, checking and approval were the team’s responsibility.</w:t>
+      </w:r>
+    </w:p>
+    <w:p>
+      <w:pPr>
+        <w:pStyle w:val="ListParagraph"/>
+        <w:numPr>
+          <w:ilvl w:val="0"/>
+          <w:numId w:val="2"/>
+        </w:numPr>
+        <w:spacing w:after="80" w:line="290"/>
+      </w:pPr>
+      <w:r>
+        <w:rPr>
+          <w:rFonts w:ascii="Arial" w:cs="Arial" w:eastAsia="Arial" w:hAnsi="Arial"/>
+          <w:b/>
+          <w:bCs/>
+        </w:rPr>
+        <w:t xml:space="preserve">Start here</w:t>
+      </w:r>
+      <w:r>
+        <w:rPr>
+          <w:rFonts w:ascii="Arial" w:cs="Arial" w:eastAsia="Arial" w:hAnsi="Arial"/>
+        </w:rPr>
+        <w:t xml:space="preserve">: the opening example is now a real translation decision from a news report (</w:t>
+      </w:r>
+      <w:r>
+        <w:rPr>
+          <w:rFonts w:ascii="Arial" w:cs="Arial" w:eastAsia="Arial" w:hAnsi="Arial"/>
+          <w:i/>
+          <w:iCs/>
+        </w:rPr>
+        <w:t xml:space="preserve">The minister stopped short of ruling out further measures.</w:t>
+      </w:r>
+      <w:r>
+        <w:rPr>
+          <w:rFonts w:ascii="Arial" w:cs="Arial" w:eastAsia="Arial" w:hAnsi="Arial"/>
+        </w:rPr>
+        <w:t xml:space="preserve"> → </w:t>
+      </w:r>
+      <w:r>
+        <w:rPr>
+          <w:rFonts w:ascii="Arial" w:cs="Arial" w:hAnsi="Arial"/>
+          <w:szCs w:val="23"/>
+          <w:rtl/>
+        </w:rPr>
+        <w:t xml:space="preserve">لم يستبعد الوزير اتخاذ مزيد من الإجراءات</w:t>
+      </w:r>
+      <w:r>
+        <w:rPr>
+          <w:rFonts w:ascii="Arial" w:cs="Arial" w:eastAsia="Arial" w:hAnsi="Arial"/>
+        </w:rPr>
+        <w:t xml:space="preserve">), instead of a simple sign.</w:t>
       </w:r>
     </w:p>
     <w:p>

</xml_diff>

<commit_message>
Start here: use the government-under-pressure example
Co-Authored-By: Claude Opus 5.5 <noreply@anthropic.com>
Claude-Session: https://claude.ai/code/session_01VkNWz9zCVkDAANuF8jpQYy
</commit_message>
<xml_diff>
--- a/Handbook-Final-Report.docx
+++ b/Handbook-Final-Report.docx
@@ -1341,7 +1341,7 @@
           <w:i/>
           <w:iCs/>
         </w:rPr>
-        <w:t xml:space="preserve">The minister stopped short of ruling out further measures.</w:t>
+        <w:t xml:space="preserve">The government came under pressure to reconsider the decision.</w:t>
       </w:r>
       <w:r>
         <w:rPr>
@@ -1355,7 +1355,7 @@
           <w:szCs w:val="23"/>
           <w:rtl/>
         </w:rPr>
-        <w:t xml:space="preserve">لم يستبعد الوزير اتخاذ مزيد من الإجراءات</w:t>
+        <w:t xml:space="preserve">تعرّضت الحكومة لضغوط لإعادة النظر في القرار</w:t>
       </w:r>
       <w:r>
         <w:rPr>

</xml_diff>